<commit_message>
fix: require print-ready leave document fields
</commit_message>
<xml_diff>
--- a/documents/leave/template_course_affairs.docx
+++ b/documents/leave/template_course_affairs.docx
@@ -4,120 +4,156 @@
   <w:body>
     <w:p>
       <w:pPr>
-        <w:spacing w:after="240"/>
+        <w:spacing w:line="360" w:lineRule="auto" w:after="360"/>
         <w:jc w:val="center"/>
       </w:pPr>
       <w:r>
         <w:rPr>
-          <w:rFonts w:ascii="宋体" w:hAnsi="宋体" w:eastAsia="宋体"/>
+          <w:rFonts w:ascii="SimSun" w:hAnsi="SimSun" w:eastAsia="??"/>
           <w:b/>
-          <w:sz w:val="32"/>
+          <w:sz w:val="36"/>
         </w:rPr>
-        <w:t>学 生 请 假 条（学工组备案）</w:t>
+        <w:t>????????????</w:t>
       </w:r>
     </w:p>
     <w:p>
       <w:pPr>
-        <w:spacing w:after="200"/>
-        <w:jc w:val="left"/>
+        <w:spacing w:line="360" w:lineRule="auto" w:after="200"/>
       </w:pPr>
       <w:r>
         <w:rPr>
-          <w:rFonts w:ascii="宋体" w:hAnsi="宋体" w:eastAsia="宋体"/>
+          <w:rFonts w:ascii="SimSun" w:hAnsi="SimSun" w:eastAsia="??"/>
           <w:b w:val="0"/>
           <w:sz w:val="24"/>
         </w:rPr>
-        <w:t>计算机学院学工组：</w:t>
+        <w:t>?????????</w:t>
       </w:r>
     </w:p>
     <w:p>
       <w:pPr>
-        <w:spacing w:after="120"/>
-        <w:ind w:firstLine="397"/>
-        <w:jc w:val="left"/>
+        <w:spacing w:line="360" w:lineRule="auto" w:after="160"/>
+        <w:ind w:firstLine="420"/>
       </w:pPr>
       <w:r>
         <w:rPr>
-          <w:rFonts w:ascii="宋体" w:hAnsi="宋体" w:eastAsia="宋体"/>
+          <w:rFonts w:ascii="SimSun" w:hAnsi="SimSun" w:eastAsia="??"/>
           <w:b w:val="0"/>
           <w:sz w:val="24"/>
         </w:rPr>
-        <w:t>我是 {{class_name}} 班学生 {{name}}（学号：{{student_id}}），因{{reason}}，请假 {{duration_days}}（时间），从 {{start_date}}{{start_time}} 时至 {{end_date}}{{end_time}} 时。</w:t>
+        <w:t>?? {{class_name}} ??? {{name}}????{{student_id}}??? {{reason}}???? {{duration_days}}?????? {{start_date}} {{start_time}} ? {{end_date}} {{end_time}}?</w:t>
       </w:r>
     </w:p>
     <w:p>
       <w:pPr>
-        <w:spacing w:after="120"/>
-        <w:jc w:val="left"/>
+        <w:spacing w:line="360" w:lineRule="auto" w:after="240"/>
+        <w:ind w:firstLine="420"/>
       </w:pPr>
       <w:r>
         <w:rPr>
-          <w:rFonts w:ascii="宋体" w:hAnsi="宋体" w:eastAsia="宋体"/>
+          <w:rFonts w:ascii="SimSun" w:hAnsi="SimSun" w:eastAsia="??"/>
           <w:b w:val="0"/>
           <w:sz w:val="24"/>
         </w:rPr>
-        <w:t>本人已经将请假事宜及时告知家长，且本人承诺请假期间注意安全，若有安全事故发生，个人按照学校有关管理规定承担相应责任。</w:t>
+        <w:t>????????????????????????????????????????????????????????</w:t>
       </w:r>
     </w:p>
     <w:p>
       <w:pPr>
-        <w:spacing w:after="200"/>
-        <w:jc w:val="left"/>
+        <w:spacing w:line="360" w:lineRule="auto" w:after="320"/>
+        <w:ind w:firstLine="420"/>
       </w:pPr>
       <w:r>
         <w:rPr>
-          <w:rFonts w:ascii="宋体" w:hAnsi="宋体" w:eastAsia="宋体"/>
+          <w:rFonts w:ascii="SimSun" w:hAnsi="SimSun" w:eastAsia="??"/>
           <w:b w:val="0"/>
           <w:sz w:val="24"/>
         </w:rPr>
-        <w:t>特此请假。</w:t>
+        <w:t>?????</w:t>
       </w:r>
     </w:p>
     <w:p>
       <w:pPr>
-        <w:spacing w:after="120"/>
-        <w:jc w:val="left"/>
+        <w:spacing w:line="360" w:lineRule="auto" w:after="120"/>
       </w:pPr>
       <w:r>
         <w:rPr>
-          <w:rFonts w:ascii="宋体" w:hAnsi="宋体" w:eastAsia="宋体"/>
+          <w:rFonts w:ascii="SimSun" w:hAnsi="SimSun" w:eastAsia="??"/>
           <w:b w:val="0"/>
           <w:sz w:val="24"/>
         </w:rPr>
-        <w:t>本人联系方式：{{student_phone}} 家长联系方式：{{parent_phone}}</w:t>
+        <w:t>???????{{student_phone}}</w:t>
       </w:r>
     </w:p>
     <w:p>
       <w:pPr>
-        <w:spacing w:after="120"/>
-        <w:jc w:val="left"/>
+        <w:spacing w:line="360" w:lineRule="auto" w:after="320"/>
       </w:pPr>
       <w:r>
         <w:rPr>
-          <w:rFonts w:ascii="宋体" w:hAnsi="宋体" w:eastAsia="宋体"/>
+          <w:rFonts w:ascii="SimSun" w:hAnsi="SimSun" w:eastAsia="??"/>
           <w:b w:val="0"/>
           <w:sz w:val="24"/>
         </w:rPr>
-        <w:t>本人签名：{{signature}}</w:t>
+        <w:t>???????{{parent_phone}}</w:t>
       </w:r>
     </w:p>
     <w:p>
       <w:pPr>
-        <w:spacing w:after="120"/>
-        <w:jc w:val="left"/>
+        <w:spacing w:line="360" w:lineRule="auto" w:after="120"/>
+        <w:jc w:val="right"/>
       </w:pPr>
       <w:r>
         <w:rPr>
-          <w:rFonts w:ascii="宋体" w:hAnsi="宋体" w:eastAsia="宋体"/>
+          <w:rFonts w:ascii="SimSun" w:hAnsi="SimSun" w:eastAsia="??"/>
+          <w:b w:val="0"/>
+          <w:sz w:val="24"/>
+        </w:rPr>
+        <w:t>?????{{signature}}</w:t>
+      </w:r>
+    </w:p>
+    <w:p>
+      <w:pPr>
+        <w:spacing w:line="360" w:lineRule="auto" w:after="280"/>
+        <w:jc w:val="right"/>
+      </w:pPr>
+      <w:r>
+        <w:rPr>
+          <w:rFonts w:ascii="SimSun" w:hAnsi="SimSun" w:eastAsia="??"/>
           <w:b w:val="0"/>
           <w:sz w:val="24"/>
         </w:rPr>
         <w:t>{{sign_date}}</w:t>
       </w:r>
     </w:p>
+    <w:p>
+      <w:pPr>
+        <w:spacing w:line="360" w:lineRule="auto" w:after="160"/>
+      </w:pPr>
+      <w:r>
+        <w:rPr>
+          <w:rFonts w:ascii="SimSun" w:hAnsi="SimSun" w:eastAsia="??"/>
+          <w:b w:val="0"/>
+          <w:sz w:val="24"/>
+        </w:rPr>
+        <w:t>???/??????</w:t>
+      </w:r>
+    </w:p>
+    <w:p>
+      <w:pPr>
+        <w:spacing w:line="360" w:lineRule="auto" w:after="120"/>
+      </w:pPr>
+      <w:r>
+        <w:rPr>
+          <w:rFonts w:ascii="SimSun" w:hAnsi="SimSun" w:eastAsia="??"/>
+          <w:b w:val="0"/>
+          <w:sz w:val="24"/>
+        </w:rPr>
+        <w:t>??????____________    ???____?__?__?</w:t>
+      </w:r>
+    </w:p>
     <w:sectPr>
       <w:pgSz w:w="12240" w:h="15840"/>
-      <w:pgMar w:top="1417" w:right="1701" w:bottom="1417" w:left="1701" w:header="720" w:footer="720" w:gutter="0"/>
+      <w:pgMar w:top="1361" w:right="1474" w:bottom="1247" w:left="1474" w:header="720" w:footer="720" w:gutter="0"/>
       <w:cols w:space="720"/>
       <w:docGrid w:linePitch="360"/>
     </w:sectPr>

</xml_diff>

<commit_message>
fix: preserve chinese text in leave templates
</commit_message>
<xml_diff>
--- a/documents/leave/template_course_affairs.docx
+++ b/documents/leave/template_course_affairs.docx
@@ -9,11 +9,11 @@
       </w:pPr>
       <w:r>
         <w:rPr>
-          <w:rFonts w:ascii="SimSun" w:hAnsi="SimSun" w:eastAsia="??"/>
+          <w:rFonts w:ascii="SimSun" w:hAnsi="SimSun" w:eastAsia="宋体"/>
           <w:b/>
           <w:sz w:val="36"/>
         </w:rPr>
-        <w:t>????????????</w:t>
+        <w:t>学生请假条（学工组备案）</w:t>
       </w:r>
     </w:p>
     <w:p>
@@ -22,11 +22,11 @@
       </w:pPr>
       <w:r>
         <w:rPr>
-          <w:rFonts w:ascii="SimSun" w:hAnsi="SimSun" w:eastAsia="??"/>
+          <w:rFonts w:ascii="SimSun" w:hAnsi="SimSun" w:eastAsia="宋体"/>
           <w:b w:val="0"/>
           <w:sz w:val="24"/>
         </w:rPr>
-        <w:t>?????????</w:t>
+        <w:t>计算机学院学工组：</w:t>
       </w:r>
     </w:p>
     <w:p>
@@ -36,11 +36,11 @@
       </w:pPr>
       <w:r>
         <w:rPr>
-          <w:rFonts w:ascii="SimSun" w:hAnsi="SimSun" w:eastAsia="??"/>
+          <w:rFonts w:ascii="SimSun" w:hAnsi="SimSun" w:eastAsia="宋体"/>
           <w:b w:val="0"/>
           <w:sz w:val="24"/>
         </w:rPr>
-        <w:t>?? {{class_name}} ??? {{name}}????{{student_id}}??? {{reason}}???? {{duration_days}}?????? {{start_date}} {{start_time}} ? {{end_date}} {{end_time}}?</w:t>
+        <w:t>我是 {{class_name}} 班学生 {{name}}（学号：{{student_id}}）。因 {{reason}}，需请假 {{duration_days}}，请假时间为 {{start_date}} {{start_time}} 至 {{end_date}} {{end_time}}。</w:t>
       </w:r>
     </w:p>
     <w:p>
@@ -50,11 +50,11 @@
       </w:pPr>
       <w:r>
         <w:rPr>
-          <w:rFonts w:ascii="SimSun" w:hAnsi="SimSun" w:eastAsia="??"/>
+          <w:rFonts w:ascii="SimSun" w:hAnsi="SimSun" w:eastAsia="宋体"/>
           <w:b w:val="0"/>
           <w:sz w:val="24"/>
         </w:rPr>
-        <w:t>????????????????????????????????????????????????????????</w:t>
+        <w:t>本人已将请假事宜及时告知家长，并承诺请假期间注意安全。如有安全事故发生，由本人按照学校有关管理规定承担相应责任。</w:t>
       </w:r>
     </w:p>
     <w:p>
@@ -64,11 +64,11 @@
       </w:pPr>
       <w:r>
         <w:rPr>
-          <w:rFonts w:ascii="SimSun" w:hAnsi="SimSun" w:eastAsia="??"/>
+          <w:rFonts w:ascii="SimSun" w:hAnsi="SimSun" w:eastAsia="宋体"/>
           <w:b w:val="0"/>
           <w:sz w:val="24"/>
         </w:rPr>
-        <w:t>?????</w:t>
+        <w:t>特此请假。</w:t>
       </w:r>
     </w:p>
     <w:p>
@@ -77,11 +77,11 @@
       </w:pPr>
       <w:r>
         <w:rPr>
-          <w:rFonts w:ascii="SimSun" w:hAnsi="SimSun" w:eastAsia="??"/>
+          <w:rFonts w:ascii="SimSun" w:hAnsi="SimSun" w:eastAsia="宋体"/>
           <w:b w:val="0"/>
           <w:sz w:val="24"/>
         </w:rPr>
-        <w:t>???????{{student_phone}}</w:t>
+        <w:t>本人联系方式：{{student_phone}}</w:t>
       </w:r>
     </w:p>
     <w:p>
@@ -90,11 +90,11 @@
       </w:pPr>
       <w:r>
         <w:rPr>
-          <w:rFonts w:ascii="SimSun" w:hAnsi="SimSun" w:eastAsia="??"/>
+          <w:rFonts w:ascii="SimSun" w:hAnsi="SimSun" w:eastAsia="宋体"/>
           <w:b w:val="0"/>
           <w:sz w:val="24"/>
         </w:rPr>
-        <w:t>???????{{parent_phone}}</w:t>
+        <w:t>家长联系方式：{{parent_phone}}</w:t>
       </w:r>
     </w:p>
     <w:p>
@@ -104,11 +104,11 @@
       </w:pPr>
       <w:r>
         <w:rPr>
-          <w:rFonts w:ascii="SimSun" w:hAnsi="SimSun" w:eastAsia="??"/>
+          <w:rFonts w:ascii="SimSun" w:hAnsi="SimSun" w:eastAsia="宋体"/>
           <w:b w:val="0"/>
           <w:sz w:val="24"/>
         </w:rPr>
-        <w:t>?????{{signature}}</w:t>
+        <w:t>本人签名：{{signature}}</w:t>
       </w:r>
     </w:p>
     <w:p>
@@ -118,7 +118,7 @@
       </w:pPr>
       <w:r>
         <w:rPr>
-          <w:rFonts w:ascii="SimSun" w:hAnsi="SimSun" w:eastAsia="??"/>
+          <w:rFonts w:ascii="SimSun" w:hAnsi="SimSun" w:eastAsia="宋体"/>
           <w:b w:val="0"/>
           <w:sz w:val="24"/>
         </w:rPr>
@@ -131,11 +131,11 @@
       </w:pPr>
       <w:r>
         <w:rPr>
-          <w:rFonts w:ascii="SimSun" w:hAnsi="SimSun" w:eastAsia="??"/>
+          <w:rFonts w:ascii="SimSun" w:hAnsi="SimSun" w:eastAsia="宋体"/>
           <w:b w:val="0"/>
           <w:sz w:val="24"/>
         </w:rPr>
-        <w:t>???/??????</w:t>
+        <w:t>学工组/辅导员意见：</w:t>
       </w:r>
     </w:p>
     <w:p>
@@ -144,11 +144,11 @@
       </w:pPr>
       <w:r>
         <w:rPr>
-          <w:rFonts w:ascii="SimSun" w:hAnsi="SimSun" w:eastAsia="??"/>
+          <w:rFonts w:ascii="SimSun" w:hAnsi="SimSun" w:eastAsia="宋体"/>
           <w:b w:val="0"/>
           <w:sz w:val="24"/>
         </w:rPr>
-        <w:t>??????____________    ???____?__?__?</w:t>
+        <w:t>审批人签名：____________    日期：____年__月__日</w:t>
       </w:r>
     </w:p>
     <w:sectPr>

</xml_diff>